<commit_message>
igualar secoes selecinadas, quebrar elementos com mais uma opção de dividir de nos pontos selecionados
</commit_message>
<xml_diff>
--- a/pendencias.docx
+++ b/pendencias.docx
@@ -11,6 +11,35 @@
       </w:pPr>
       <w:r>
         <w:rPr/>
+        <w:t> </w:t>
+      </w:r>
+      <w:r>
+        <w:rPr/>
+        <w:t xml:space="preserve">We are constantly developing the system, improving the user interface, enhancing the capabilities and adding new design modules </w:t>
+      </w:r>
+    </w:p>
+    <w:p>
+      <w:pPr>
+        <w:pStyle w:val="Normal"/>
+        <w:rPr>
+          <w:u w:val="single"/>
+        </w:rPr>
+      </w:pPr>
+      <w:r>
+        <w:rPr>
+          <w:u w:val="single"/>
+        </w:rPr>
+      </w:r>
+    </w:p>
+    <w:p>
+      <w:pPr>
+        <w:pStyle w:val="Normal"/>
+        <w:rPr>
+          <w:u w:val="single"/>
+        </w:rPr>
+      </w:pPr>
+      <w:r>
+        <w:rPr/>
         <w:t>ao mover barra , apaga as cargas dela</w:t>
       </w:r>
     </w:p>
@@ -862,6 +891,61 @@
       <w:r>
         <w:rPr/>
         <w:t>opção de igualar elementos(secao,angulo, tipo etc)</w:t>
+      </w:r>
+    </w:p>
+    <w:p>
+      <w:pPr>
+        <w:pStyle w:val="Normal"/>
+        <w:widowControl/>
+        <w:bidi w:val="0"/>
+        <w:spacing w:lineRule="auto" w:line="259" w:before="0" w:after="160"/>
+        <w:jc w:val="left"/>
+        <w:rPr/>
+      </w:pPr>
+      <w:r>
+        <w:rPr/>
+      </w:r>
+    </w:p>
+    <w:p>
+      <w:pPr>
+        <w:pStyle w:val="Normal"/>
+        <w:widowControl/>
+        <w:bidi w:val="0"/>
+        <w:spacing w:lineRule="auto" w:line="259" w:before="0" w:after="160"/>
+        <w:jc w:val="left"/>
+        <w:rPr/>
+      </w:pPr>
+      <w:r>
+        <w:rPr/>
+        <w:t>bota interromper</w:t>
+      </w:r>
+    </w:p>
+    <w:p>
+      <w:pPr>
+        <w:pStyle w:val="Normal"/>
+        <w:widowControl/>
+        <w:bidi w:val="0"/>
+        <w:spacing w:lineRule="auto" w:line="259" w:before="0" w:after="160"/>
+        <w:jc w:val="left"/>
+        <w:rPr/>
+      </w:pPr>
+      <w:r>
+        <w:rPr/>
+        <w:t>barra rigida desvincular da scao tranversal</w:t>
+      </w:r>
+    </w:p>
+    <w:p>
+      <w:pPr>
+        <w:pStyle w:val="Normal"/>
+        <w:widowControl/>
+        <w:bidi w:val="0"/>
+        <w:spacing w:lineRule="auto" w:line="259" w:before="0" w:after="160"/>
+        <w:jc w:val="left"/>
+        <w:rPr/>
+      </w:pPr>
+      <w:r>
+        <w:rPr/>
+        <w:t>criar opções de analise separadas (modal, flambagem,linear, não linear somente)</w:t>
       </w:r>
     </w:p>
     <w:sectPr>

</xml_diff>